<commit_message>
fix pdf knitting (was caused by underscores in chunk labels)
</commit_message>
<xml_diff>
--- a/paper/manuscript.docx
+++ b/paper/manuscript.docx
@@ -3919,8 +3919,8 @@
         <m:d>
           <m:dPr>
             <m:begChr m:val="("/>
+            <m:sepChr m:val=""/>
             <m:endChr m:val=")"/>
-            <m:sepChr m:val=""/>
             <m:grow/>
           </m:dPr>
           <m:e>
@@ -6307,8 +6307,8 @@
         <m:d>
           <m:dPr>
             <m:begChr m:val="("/>
+            <m:sepChr m:val=""/>
             <m:endChr m:val=")"/>
-            <m:sepChr m:val=""/>
             <m:grow/>
           </m:dPr>
           <m:e>

</xml_diff>